<commit_message>
Chuyển nội dung Thông tư 83/2026 từ Chương 2 sang mục Thời cơ và thách thức của Chương 3
Thông tư có hiệu lực từ 15/11/2026, chưa áp dụng cho giai đoạn đánh giá thực trạng.
Chương 2 bỏ Mục 2.1.3 và các câu liên quan, số bảng tự đánh lại; Chương 3 thêm Mục 3.1.2 Thời cơ và thách thức
ở chế độ theo dõi thay đổi, Mục 3.1.2 cũ thành 3.1.3.

Co-Authored-By: Claude Opus 5.5 <noreply@anthropic.com>
Claude-Session: https://claude.ai/code/session_01ThGArqDrUUsqC1zG1BQvVL
</commit_message>
<xml_diff>
--- a/Chuong_2_Thuc_trang_rut_gon.docx
+++ b/Chuong_2_Thuc_trang_rut_gon.docx
@@ -3211,687 +3211,6 @@
     <w:p>
       <w:pPr>
         <w:keepNext/>
-        <w:spacing w:before="200" w:after="100"/>
-        <w:ind w:firstLine="0"/>
-        <w:outlineLvl w:val="2"/>
-        <w:rPr>
-          <w:szCs w:val="26"/>
-        </w:rPr>
-      </w:pPr>
-      <w:r>
-        <w:rPr>
-          <w:b/>
-          <w:szCs w:val="26"/>
-        </w:rPr>
-        <w:t>2.1.3. Yêu cầu của Chuẩn cơ sở giáo dục đại học mới đối với hoạt động sở hữu trí tuệ</w:t>
-      </w:r>
-    </w:p>
-    <w:p>
-      <w:pPr>
-        <w:rPr>
-          <w:szCs w:val="26"/>
-        </w:rPr>
-      </w:pPr>
-      <w:r>
-        <w:rPr>
-          <w:szCs w:val="26"/>
-        </w:rPr>
-        <w:t>Ngày 30 tháng 9 năm 2026, Bộ trưởng Bộ Giáo dục và Đào tạo ban hành Thông tư số 83/2026/TT-BGDĐT quy định Chuẩn cơ sở giáo dục đại học, có hiệu lực từ ngày 15 tháng 11 năm 2026 và thay thế Thông tư số 01/2024/TT-BGDĐT. Đây là thước đo bắt buộc mà Nhà trường được đánh giá hằng năm qua dữ liệu trên HEMIS. Những thay đổi liên quan đến sở hữu trí tuệ và vị trí hiện tại của Nhà trường được trình bày tại Bảng 2.3.</w:t>
-      </w:r>
-    </w:p>
-    <w:p>
-      <w:pPr>
-        <w:keepNext/>
-        <w:spacing w:before="160" w:after="80"/>
-        <w:ind w:firstLine="0"/>
-        <w:jc w:val="center"/>
-        <w:rPr>
-          <w:szCs w:val="26"/>
-        </w:rPr>
-      </w:pPr>
-      <w:r>
-        <w:rPr>
-          <w:b/>
-          <w:szCs w:val="26"/>
-        </w:rPr>
-        <w:t>Bảng 2.3. Thay đổi của Chuẩn cơ sở giáo dục đại học liên quan đến sở hữu trí tuệ và vị trí của Nhà trường</w:t>
-      </w:r>
-    </w:p>
-    <w:tbl>
-      <w:tblPr>
-        <w:tblStyle w:val="TableGrid"/>
-        <w:tblW w:w="0" w:type="auto"/>
-        <w:jc w:val="center"/>
-        <w:tblLook w:val="04A0" w:firstRow="1" w:lastRow="0" w:firstColumn="1" w:lastColumn="0" w:noHBand="0" w:noVBand="1"/>
-      </w:tblPr>
-      <w:tblGrid>
-        <w:gridCol w:w="1593"/>
-        <w:gridCol w:w="2083"/>
-        <w:gridCol w:w="2819"/>
-        <w:gridCol w:w="2573"/>
-      </w:tblGrid>
-      <w:tr>
-        <w:trPr>
-          <w:cantSplit/>
-          <w:tblHeader/>
-        </w:trPr>
-        <w:tc>
-          <w:tcPr>
-            <w:tcW w:w="1593" w:type="dxa"/>
-            <w:shd w:val="clear" w:color="auto" w:fill="DCE8F7"/>
-            <w:vAlign w:val="center"/>
-          </w:tcPr>
-          <w:p>
-            <w:pPr>
-              <w:spacing w:before="20" w:after="20" w:line="252" w:lineRule="auto"/>
-              <w:ind w:firstLine="0"/>
-              <w:jc w:val="center"/>
-            </w:pPr>
-            <w:r>
-              <w:rPr>
-                <w:b/>
-                <w:sz w:val="24"/>
-              </w:rPr>
-              <w:t xml:space="preserve">Nội dung</w:t>
-            </w:r>
-          </w:p>
-        </w:tc>
-        <w:tc>
-          <w:tcPr>
-            <w:tcW w:w="2083" w:type="dxa"/>
-            <w:shd w:val="clear" w:color="auto" w:fill="DCE8F7"/>
-            <w:vAlign w:val="center"/>
-          </w:tcPr>
-          <w:p>
-            <w:pPr>
-              <w:spacing w:before="20" w:after="20" w:line="252" w:lineRule="auto"/>
-              <w:ind w:firstLine="0"/>
-              <w:jc w:val="center"/>
-            </w:pPr>
-            <w:r>
-              <w:rPr>
-                <w:b/>
-                <w:sz w:val="24"/>
-              </w:rPr>
-              <w:t xml:space="preserve">Thông tư 01/2024/TT-BGDĐT</w:t>
-            </w:r>
-          </w:p>
-        </w:tc>
-        <w:tc>
-          <w:tcPr>
-            <w:tcW w:w="2819" w:type="dxa"/>
-            <w:shd w:val="clear" w:color="auto" w:fill="DCE8F7"/>
-            <w:vAlign w:val="center"/>
-          </w:tcPr>
-          <w:p>
-            <w:pPr>
-              <w:spacing w:before="20" w:after="20" w:line="252" w:lineRule="auto"/>
-              <w:ind w:firstLine="0"/>
-              <w:jc w:val="center"/>
-            </w:pPr>
-            <w:r>
-              <w:rPr>
-                <w:b/>
-                <w:sz w:val="24"/>
-              </w:rPr>
-              <w:t xml:space="preserve">Thông tư 83/2026/TT-BGDĐT</w:t>
-            </w:r>
-          </w:p>
-        </w:tc>
-        <w:tc>
-          <w:tcPr>
-            <w:tcW w:w="2573" w:type="dxa"/>
-            <w:shd w:val="clear" w:color="auto" w:fill="DCE8F7"/>
-            <w:vAlign w:val="center"/>
-          </w:tcPr>
-          <w:p>
-            <w:pPr>
-              <w:spacing w:before="20" w:after="20" w:line="252" w:lineRule="auto"/>
-              <w:ind w:firstLine="0"/>
-              <w:jc w:val="center"/>
-            </w:pPr>
-            <w:r>
-              <w:rPr>
-                <w:b/>
-                <w:sz w:val="24"/>
-              </w:rPr>
-              <w:t xml:space="preserve">Trường Đại học Thành Đô</w:t>
-            </w:r>
-          </w:p>
-        </w:tc>
-      </w:tr>
-      <w:tr>
-        <w:trPr>
-          <w:cantSplit/>
-        </w:trPr>
-        <w:tc>
-          <w:tcPr>
-            <w:tcW w:w="1593" w:type="dxa"/>
-            <w:vAlign w:val="center"/>
-          </w:tcPr>
-          <w:p>
-            <w:pPr>
-              <w:spacing w:before="20" w:after="20" w:line="252" w:lineRule="auto"/>
-              <w:ind w:firstLine="0"/>
-              <w:jc w:val="left"/>
-            </w:pPr>
-            <w:r>
-              <w:rPr>
-                <w:sz w:val="24"/>
-              </w:rPr>
-              <w:t xml:space="preserve">Văn bản quản trị nội bộ bắt buộc</w:t>
-            </w:r>
-          </w:p>
-        </w:tc>
-        <w:tc>
-          <w:tcPr>
-            <w:tcW w:w="2083" w:type="dxa"/>
-            <w:vAlign w:val="center"/>
-          </w:tcPr>
-          <w:p>
-            <w:pPr>
-              <w:spacing w:before="20" w:after="20" w:line="252" w:lineRule="auto"/>
-              <w:ind w:firstLine="0"/>
-              <w:jc w:val="left"/>
-            </w:pPr>
-            <w:r>
-              <w:rPr>
-                <w:sz w:val="24"/>
-              </w:rPr>
-              <w:t xml:space="preserve">7 văn bản, không có quy định về sở hữu trí tuệ</w:t>
-            </w:r>
-          </w:p>
-        </w:tc>
-        <w:tc>
-          <w:tcPr>
-            <w:tcW w:w="2819" w:type="dxa"/>
-            <w:vAlign w:val="center"/>
-          </w:tcPr>
-          <w:p>
-            <w:pPr>
-              <w:spacing w:before="20" w:after="20" w:line="252" w:lineRule="auto"/>
-              <w:ind w:firstLine="0"/>
-              <w:jc w:val="left"/>
-            </w:pPr>
-            <w:r>
-              <w:rPr>
-                <w:sz w:val="24"/>
-              </w:rPr>
-              <w:t xml:space="preserve">21 nội dung, trong đó nội dung 14 về hoạt động khoa học, công nghệ và đổi mới sáng tạo, nội dung 15 về sở hữu trí tuệ, liêm chính khoa học, liêm chính học thuật; phải đúng thẩm quyền và còn hiệu lực</w:t>
-            </w:r>
-          </w:p>
-        </w:tc>
-        <w:tc>
-          <w:tcPr>
-            <w:tcW w:w="2573" w:type="dxa"/>
-            <w:vAlign w:val="center"/>
-          </w:tcPr>
-          <w:p>
-            <w:pPr>
-              <w:spacing w:before="20" w:after="20" w:line="252" w:lineRule="auto"/>
-              <w:ind w:firstLine="0"/>
-              <w:jc w:val="left"/>
-            </w:pPr>
-            <w:r>
-              <w:rPr>
-                <w:sz w:val="24"/>
-              </w:rPr>
-              <w:t xml:space="preserve">Có Quyết định 213 năm 2021 và Quyết định 217 năm 2024, hai văn bản chồng lấn về phân chia lợi ích; chưa có quy định về liêm chính khoa học, liêm chính học thuật</w:t>
-            </w:r>
-          </w:p>
-        </w:tc>
-      </w:tr>
-      <w:tr>
-        <w:trPr>
-          <w:cantSplit/>
-        </w:trPr>
-        <w:tc>
-          <w:tcPr>
-            <w:tcW w:w="1593" w:type="dxa"/>
-            <w:vAlign w:val="center"/>
-          </w:tcPr>
-          <w:p>
-            <w:pPr>
-              <w:spacing w:before="20" w:after="20" w:line="252" w:lineRule="auto"/>
-              <w:ind w:firstLine="0"/>
-              <w:jc w:val="left"/>
-            </w:pPr>
-            <w:r>
-              <w:rPr>
-                <w:sz w:val="24"/>
-              </w:rPr>
-              <w:t xml:space="preserve">Chỉ số hoạt động chính</w:t>
-            </w:r>
-          </w:p>
-        </w:tc>
-        <w:tc>
-          <w:tcPr>
-            <w:tcW w:w="2083" w:type="dxa"/>
-            <w:vAlign w:val="center"/>
-          </w:tcPr>
-          <w:p>
-            <w:pPr>
-              <w:spacing w:before="20" w:after="20" w:line="252" w:lineRule="auto"/>
-              <w:ind w:firstLine="0"/>
-              <w:jc w:val="left"/>
-            </w:pPr>
-            <w:r>
-              <w:rPr>
-                <w:sz w:val="24"/>
-              </w:rPr>
-              <w:t xml:space="preserve">Ít nhất 50% chỉ số được cải thiện</w:t>
-            </w:r>
-          </w:p>
-        </w:tc>
-        <w:tc>
-          <w:tcPr>
-            <w:tcW w:w="2819" w:type="dxa"/>
-            <w:vAlign w:val="center"/>
-          </w:tcPr>
-          <w:p>
-            <w:pPr>
-              <w:spacing w:before="20" w:after="20" w:line="252" w:lineRule="auto"/>
-              <w:ind w:firstLine="0"/>
-              <w:jc w:val="left"/>
-            </w:pPr>
-            <w:r>
-              <w:rPr>
-                <w:sz w:val="24"/>
-              </w:rPr>
-              <w:t xml:space="preserve">Ít nhất 50% chỉ số đạt hoặc vượt mục tiêu kế hoạch năm</w:t>
-            </w:r>
-          </w:p>
-        </w:tc>
-        <w:tc>
-          <w:tcPr>
-            <w:tcW w:w="2573" w:type="dxa"/>
-            <w:vAlign w:val="center"/>
-          </w:tcPr>
-          <w:p>
-            <w:pPr>
-              <w:spacing w:before="20" w:after="20" w:line="252" w:lineRule="auto"/>
-              <w:ind w:firstLine="0"/>
-              <w:jc w:val="left"/>
-            </w:pPr>
-            <w:r>
-              <w:rPr>
-                <w:sz w:val="24"/>
-              </w:rPr>
-              <w:t xml:space="preserve">7 trên 10 chỉ tiêu khoa học công nghệ của Kế hoạch 07/KH-ĐHTĐ đạt trong hai năm 2024 - 2025; chỉ tiêu chuyển giao công nghệ không đạt</w:t>
-            </w:r>
-          </w:p>
-        </w:tc>
-      </w:tr>
-      <w:tr>
-        <w:trPr>
-          <w:cantSplit/>
-        </w:trPr>
-        <w:tc>
-          <w:tcPr>
-            <w:tcW w:w="1593" w:type="dxa"/>
-            <w:vAlign w:val="center"/>
-          </w:tcPr>
-          <w:p>
-            <w:pPr>
-              <w:spacing w:before="20" w:after="20" w:line="252" w:lineRule="auto"/>
-              <w:ind w:firstLine="0"/>
-              <w:jc w:val="left"/>
-            </w:pPr>
-            <w:r>
-              <w:rPr>
-                <w:sz w:val="24"/>
-              </w:rPr>
-              <w:t xml:space="preserve">Dữ liệu trên HEMIS</w:t>
-            </w:r>
-          </w:p>
-        </w:tc>
-        <w:tc>
-          <w:tcPr>
-            <w:tcW w:w="2083" w:type="dxa"/>
-            <w:vAlign w:val="center"/>
-          </w:tcPr>
-          <w:p>
-            <w:pPr>
-              <w:spacing w:before="20" w:after="20" w:line="252" w:lineRule="auto"/>
-              <w:ind w:firstLine="0"/>
-              <w:jc w:val="left"/>
-            </w:pPr>
-            <w:r>
-              <w:rPr>
-                <w:sz w:val="24"/>
-              </w:rPr>
-              <w:t xml:space="preserve">Dữ liệu kết quả hoạt động cập nhật trên HEMIS</w:t>
-            </w:r>
-          </w:p>
-        </w:tc>
-        <w:tc>
-          <w:tcPr>
-            <w:tcW w:w="2819" w:type="dxa"/>
-            <w:vAlign w:val="center"/>
-          </w:tcPr>
-          <w:p>
-            <w:pPr>
-              <w:spacing w:before="20" w:after="20" w:line="252" w:lineRule="auto"/>
-              <w:ind w:firstLine="0"/>
-              <w:jc w:val="left"/>
-            </w:pPr>
-            <w:r>
-              <w:rPr>
-                <w:sz w:val="24"/>
-              </w:rPr>
-              <w:t xml:space="preserve">Giữ yêu cầu, bổ sung yêu cầu đúng định dạng, đúng thời hạn</w:t>
-            </w:r>
-          </w:p>
-        </w:tc>
-        <w:tc>
-          <w:tcPr>
-            <w:tcW w:w="2573" w:type="dxa"/>
-            <w:vAlign w:val="center"/>
-          </w:tcPr>
-          <w:p>
-            <w:pPr>
-              <w:spacing w:before="20" w:after="20" w:line="252" w:lineRule="auto"/>
-              <w:ind w:firstLine="0"/>
-              <w:jc w:val="left"/>
-            </w:pPr>
-            <w:r>
-              <w:rPr>
-                <w:sz w:val="24"/>
-              </w:rPr>
-              <w:t xml:space="preserve">Hệ thống thống kê khoa học công nghệ chưa có danh mục tài sản trí tuệ</w:t>
-            </w:r>
-          </w:p>
-        </w:tc>
-      </w:tr>
-      <w:tr>
-        <w:trPr>
-          <w:cantSplit/>
-        </w:trPr>
-        <w:tc>
-          <w:tcPr>
-            <w:tcW w:w="1593" w:type="dxa"/>
-            <w:vAlign w:val="center"/>
-          </w:tcPr>
-          <w:p>
-            <w:pPr>
-              <w:spacing w:before="20" w:after="20" w:line="252" w:lineRule="auto"/>
-              <w:ind w:firstLine="0"/>
-              <w:jc w:val="left"/>
-            </w:pPr>
-            <w:r>
-              <w:rPr>
-                <w:sz w:val="24"/>
-              </w:rPr>
-              <w:t xml:space="preserve">Kết quả khoa học trên giảng viên</w:t>
-            </w:r>
-          </w:p>
-        </w:tc>
-        <w:tc>
-          <w:tcPr>
-            <w:tcW w:w="2083" w:type="dxa"/>
-            <w:vAlign w:val="center"/>
-          </w:tcPr>
-          <w:p>
-            <w:pPr>
-              <w:spacing w:before="20" w:after="20" w:line="252" w:lineRule="auto"/>
-              <w:ind w:firstLine="0"/>
-              <w:jc w:val="left"/>
-            </w:pPr>
-            <w:r>
-              <w:rPr>
-                <w:sz w:val="24"/>
-              </w:rPr>
-              <w:t xml:space="preserve">P = P1 + 3P2 + 5P3, giải pháp hữu ích hệ số 1, sáng chế hệ số 5; chia cho giảng viên toàn thời gian</w:t>
-            </w:r>
-          </w:p>
-        </w:tc>
-        <w:tc>
-          <w:tcPr>
-            <w:tcW w:w="2819" w:type="dxa"/>
-            <w:vAlign w:val="center"/>
-          </w:tcPr>
-          <w:p>
-            <w:pPr>
-              <w:spacing w:before="20" w:after="20" w:line="252" w:lineRule="auto"/>
-              <w:ind w:firstLine="0"/>
-              <w:jc w:val="left"/>
-            </w:pPr>
-            <w:r>
-              <w:rPr>
-                <w:sz w:val="24"/>
-              </w:rPr>
-              <w:t xml:space="preserve">P = P1 + 2P2 + 3P3 + 5P4, bài WoS, Scopus hệ số 2, sách chuyên khảo và giải pháp hữu ích hệ số 3, sáng chế hệ số 5; chia cho giảng viên quy đổi; ngưỡng 0,6 với cơ sở có đào tạo tiến sĩ</w:t>
-            </w:r>
-          </w:p>
-        </w:tc>
-        <w:tc>
-          <w:tcPr>
-            <w:tcW w:w="2573" w:type="dxa"/>
-            <w:vAlign w:val="center"/>
-          </w:tcPr>
-          <w:p>
-            <w:pPr>
-              <w:spacing w:before="20" w:after="20" w:line="252" w:lineRule="auto"/>
-              <w:ind w:firstLine="0"/>
-              <w:jc w:val="left"/>
-            </w:pPr>
-            <w:r>
-              <w:rPr>
-                <w:sz w:val="24"/>
-              </w:rPr>
-              <w:t xml:space="preserve">Ước tính năm 2025 từ 0,63 đến 1,6, vượt ngưỡng mà không cần văn bằng nào</w:t>
-            </w:r>
-          </w:p>
-        </w:tc>
-      </w:tr>
-      <w:tr>
-        <w:trPr>
-          <w:cantSplit/>
-        </w:trPr>
-        <w:tc>
-          <w:tcPr>
-            <w:tcW w:w="1593" w:type="dxa"/>
-            <w:vAlign w:val="center"/>
-          </w:tcPr>
-          <w:p>
-            <w:pPr>
-              <w:spacing w:before="20" w:after="20" w:line="252" w:lineRule="auto"/>
-              <w:ind w:firstLine="0"/>
-              <w:jc w:val="left"/>
-            </w:pPr>
-            <w:r>
-              <w:rPr>
-                <w:sz w:val="24"/>
-              </w:rPr>
-              <w:t xml:space="preserve">Công bố WoS, Scopus trên giảng viên</w:t>
-            </w:r>
-          </w:p>
-        </w:tc>
-        <w:tc>
-          <w:tcPr>
-            <w:tcW w:w="2083" w:type="dxa"/>
-            <w:vAlign w:val="center"/>
-          </w:tcPr>
-          <w:p>
-            <w:pPr>
-              <w:spacing w:before="20" w:after="20" w:line="252" w:lineRule="auto"/>
-              <w:ind w:firstLine="0"/>
-              <w:jc w:val="left"/>
-            </w:pPr>
-            <w:r>
-              <w:rPr>
-                <w:sz w:val="24"/>
-              </w:rPr>
-              <w:t xml:space="preserve">Ít nhất 0,3 bài với cơ sở có đào tạo tiến sĩ</w:t>
-            </w:r>
-          </w:p>
-        </w:tc>
-        <w:tc>
-          <w:tcPr>
-            <w:tcW w:w="2819" w:type="dxa"/>
-            <w:vAlign w:val="center"/>
-          </w:tcPr>
-          <w:p>
-            <w:pPr>
-              <w:spacing w:before="20" w:after="20" w:line="252" w:lineRule="auto"/>
-              <w:ind w:firstLine="0"/>
-              <w:jc w:val="left"/>
-            </w:pPr>
-            <w:r>
-              <w:rPr>
-                <w:sz w:val="24"/>
-              </w:rPr>
-              <w:t xml:space="preserve">Ít nhất 0,3 trên giảng viên quy đổi, có trọng số lĩnh vực</w:t>
-            </w:r>
-          </w:p>
-        </w:tc>
-        <w:tc>
-          <w:tcPr>
-            <w:tcW w:w="2573" w:type="dxa"/>
-            <w:vAlign w:val="center"/>
-          </w:tcPr>
-          <w:p>
-            <w:pPr>
-              <w:spacing w:before="20" w:after="20" w:line="252" w:lineRule="auto"/>
-              <w:ind w:firstLine="0"/>
-              <w:jc w:val="left"/>
-            </w:pPr>
-            <w:r>
-              <w:rPr>
-                <w:sz w:val="24"/>
-              </w:rPr>
-              <w:t xml:space="preserve">Khoảng 0,31 năm 2025 và 0,22 năm 2024, sát hoặc dưới ngưỡng; văn bằng không được tính</w:t>
-            </w:r>
-          </w:p>
-        </w:tc>
-      </w:tr>
-      <w:tr>
-        <w:trPr>
-          <w:cantSplit/>
-        </w:trPr>
-        <w:tc>
-          <w:tcPr>
-            <w:tcW w:w="1593" w:type="dxa"/>
-            <w:vAlign w:val="center"/>
-          </w:tcPr>
-          <w:p>
-            <w:pPr>
-              <w:spacing w:before="20" w:after="20" w:line="252" w:lineRule="auto"/>
-              <w:ind w:firstLine="0"/>
-              <w:jc w:val="left"/>
-            </w:pPr>
-            <w:r>
-              <w:rPr>
-                <w:sz w:val="24"/>
-              </w:rPr>
-              <w:t xml:space="preserve">Thu khoa học, công nghệ</w:t>
-            </w:r>
-          </w:p>
-        </w:tc>
-        <w:tc>
-          <w:tcPr>
-            <w:tcW w:w="2083" w:type="dxa"/>
-            <w:vAlign w:val="center"/>
-          </w:tcPr>
-          <w:p>
-            <w:pPr>
-              <w:spacing w:before="20" w:after="20" w:line="252" w:lineRule="auto"/>
-              <w:ind w:firstLine="0"/>
-              <w:jc w:val="left"/>
-            </w:pPr>
-            <w:r>
-              <w:rPr>
-                <w:sz w:val="24"/>
-              </w:rPr>
-              <w:t xml:space="preserve">Ít nhất 5% tổng thu với cơ sở có đào tạo tiến sĩ</w:t>
-            </w:r>
-          </w:p>
-        </w:tc>
-        <w:tc>
-          <w:tcPr>
-            <w:tcW w:w="2819" w:type="dxa"/>
-            <w:vAlign w:val="center"/>
-          </w:tcPr>
-          <w:p>
-            <w:pPr>
-              <w:spacing w:before="20" w:after="20" w:line="252" w:lineRule="auto"/>
-              <w:ind w:firstLine="0"/>
-              <w:jc w:val="left"/>
-            </w:pPr>
-            <w:r>
-              <w:rPr>
-                <w:sz w:val="24"/>
-              </w:rPr>
-              <w:t xml:space="preserve">Giữ ngưỡng 5%; tách riêng khoản thu từ thương mại hóa kết quả nghiên cứu, sở hữu trí tuệ, spin-off, start-up</w:t>
-            </w:r>
-          </w:p>
-        </w:tc>
-        <w:tc>
-          <w:tcPr>
-            <w:tcW w:w="2573" w:type="dxa"/>
-            <w:vAlign w:val="center"/>
-          </w:tcPr>
-          <w:p>
-            <w:pPr>
-              <w:spacing w:before="20" w:after="20" w:line="252" w:lineRule="auto"/>
-              <w:ind w:firstLine="0"/>
-              <w:jc w:val="left"/>
-            </w:pPr>
-            <w:r>
-              <w:rPr>
-                <w:sz w:val="24"/>
-              </w:rPr>
-              <w:t xml:space="preserve">Chưa có số liệu tách bạch; thu từ khai thác quyền mới ghi nhận ở 2 hợp đồng bản quyền theo doanh số</w:t>
-            </w:r>
-          </w:p>
-        </w:tc>
-      </w:tr>
-    </w:tbl>
-    <w:p>
-      <w:pPr>
-        <w:spacing w:after="160"/>
-        <w:ind w:firstLine="0"/>
-        <w:rPr>
-          <w:szCs w:val="26"/>
-        </w:rPr>
-      </w:pPr>
-      <w:r>
-        <w:rPr>
-          <w:i/>
-          <w:szCs w:val="26"/>
-        </w:rPr>
-        <w:t>Nguồn: Nhóm nghiên cứu đối chiếu Thông tư số 01/2024/TT-BGDĐT và Thông tư số 83/2026/TT-BGDĐT; ước tính từ Bảng 2.1, Bảng 2.2 và danh mục bài báo quốc tế. Giảng viên quy đổi tạm tính theo danh sách năm 2026: 83 giảng viên tiến sĩ và tương đương hệ số 1,0, 58 thạc sĩ và tương đương hệ số 0,75, 3 đại học hệ số 0,5, tổng 128,0. Bài báo có phân hạng Q được coi là thuộc WoS hoặc Scopus; chưa áp dụng hệ số lĩnh vực. Công thức tại mục 6.2.1 Phụ lục II xếp bằng độc quyền giải pháp hữu ích vào nhóm hệ số 3, nhưng bảng tổng hợp cuối Phụ lục II chưa nêu loại này.</w:t>
-      </w:r>
-    </w:p>
-    <w:p>
-      <w:pPr>
-        <w:rPr>
-          <w:szCs w:val="26"/>
-        </w:rPr>
-      </w:pPr>
-      <w:r>
-        <w:rPr>
-          <w:szCs w:val="26"/>
-        </w:rPr>
-        <w:t>Bảng 2.3 cho thấy Chuẩn mới tác động đến quản lý quyền sở hữu trí tuệ theo hai chiều. Ở chiều thể chế và dữ liệu, yêu cầu chặt hơn: lần đầu tiên quy định về sở hữu trí tuệ nằm trong danh mục văn bản quản trị bắt buộc, gắn với liêm chính khoa học và liêm chính học thuật, trong khi Quyết định 213 và Quyết định 217 chưa có nội dung về liêm chính và còn chồng lấn nhau. Dữ liệu kết quả hoạt động phải nhất quán trên HEMIS, trong khi hệ thống thống kê hiện hành chưa theo dõi tài sản trí tuệ.</w:t>
-      </w:r>
-    </w:p>
-    <w:p>
-      <w:pPr>
-        <w:rPr>
-          <w:szCs w:val="26"/>
-        </w:rPr>
-      </w:pPr>
-      <w:r>
-        <w:rPr>
-          <w:szCs w:val="26"/>
-        </w:rPr>
-        <w:t>Ở chiều kết quả, Chuẩn mới nâng giá trị của văn bằng nhưng chưa tạo sức ép buộc Nhà trường đăng ký. Một bằng độc quyền giải pháp hữu ích được tính 3 sản phẩm quy đổi thay cho 1 như trước; nếu 8 sản phẩm đề tài phù hợp với giải pháp hữu ích được cấp văn bằng, Nhà trường có thêm 24 sản phẩm quy đổi. Tuy nhiên, chỉ riêng 40 bài báo có phân hạng Q năm 2025 đã cho khoảng 0,63 sản phẩm quy đổi trên một giảng viên quy đổi, vượt ngưỡng 0,6. Ràng buộc thực sự là chỉ số công bố WoS, Scopus, khoảng 0,31 năm 2025 so với ngưỡng 0,3, và văn bằng không được tính vào chỉ số này. Chuẩn mới vì vậy tiếp tục kéo nguồn lực về công bố quốc tế; nếu không có bước rà soát trước khi công bố, sức ép này làm tăng nguy cơ kết quả nghiên cứu mất tính mới trước khi kịp nộp đơn.</w:t>
-      </w:r>
-    </w:p>
-    <w:p>
-      <w:pPr>
-        <w:keepNext/>
         <w:spacing w:before="280" w:after="160"/>
         <w:ind w:firstLine="0"/>
         <w:outlineLvl w:val="1"/>
@@ -3948,7 +3267,7 @@
         <w:rPr>
           <w:szCs w:val="26"/>
         </w:rPr>
-        <w:t>Quyết định 217 không dẫn chiếu và không thay thế Chương VI Quyết định 213, nên hai văn bản cùng hiệu lực. Bốn văn bản chứa năm quy định khác nhau về phân chia lợi ích, được trình bày tại Bảng 2.4.</w:t>
+        <w:t>Quyết định 217 không dẫn chiếu và không thay thế Chương VI Quyết định 213, nên hai văn bản cùng hiệu lực. Bốn văn bản chứa năm quy định khác nhau về phân chia lợi ích, được trình bày tại Bảng 2.3.</w:t>
       </w:r>
     </w:p>
     <w:p>
@@ -3966,7 +3285,7 @@
           <w:b/>
           <w:szCs w:val="26"/>
         </w:rPr>
-        <w:t>Bảng 2.4. Các quy định về phân chia lợi ích từ tài sản trí tuệ trong nội bộ Trường Đại học Thành Đô</w:t>
+        <w:t>Bảng 2.3. Các quy định về phân chia lợi ích từ tài sản trí tuệ trong nội bộ Trường Đại học Thành Đô</w:t>
       </w:r>
     </w:p>
     <w:tbl>
@@ -4772,7 +4091,7 @@
         <w:rPr>
           <w:szCs w:val="26"/>
         </w:rPr>
-        <w:t>Nhà trường có ba kênh tài trợ nghiên cứu với chế độ sở hữu trí tuệ khác nhau, được trình bày tại Bảng 2.5.</w:t>
+        <w:t>Nhà trường có ba kênh tài trợ nghiên cứu với chế độ sở hữu trí tuệ khác nhau, được trình bày tại Bảng 2.4.</w:t>
       </w:r>
     </w:p>
     <w:p>
@@ -4790,7 +4109,7 @@
           <w:b/>
           <w:szCs w:val="26"/>
         </w:rPr>
-        <w:t>Bảng 2.5. Ba kênh tài trợ nghiên cứu và chế độ sở hữu trí tuệ tương ứng</w:t>
+        <w:t>Bảng 2.4. Ba kênh tài trợ nghiên cứu và chế độ sở hữu trí tuệ tương ứng</w:t>
       </w:r>
     </w:p>
     <w:tbl>
@@ -5166,7 +4485,7 @@
         <w:rPr>
           <w:szCs w:val="26"/>
         </w:rPr>
-        <w:t>Bảng 2.5 cho thấy nguồn lực không thiếu nhưng đặt chưa đúng chỗ. Quỹ Học bổng sau tiến sĩ Ngô Xuân Độ có ngân sách 5 tỷ đồng, có khoản chi phí khác đủ trang trải chi phí đăng ký và quy định rõ về đồng sở hữu văn bằng, nhưng chỉ dành cho nhà khoa học theo diện học bổng sau tiến sĩ. Đề tài cấp cơ sở, kênh duy nhất đến nay tạo ra sản phẩm đủ điều kiện xác lập quyền, chỉ được Nhà trường cấp 424,75 triệu đồng trong năm năm, bằng 8,5% ngân sách Quỹ, và không có dòng chi cho phí nộp đơn, phí duy trì hiệu lực. Điều 38 Quyết định 213 không có mục chi riêng cho lệ phí đăng ký; Điều 13 Quyết định 217 chỉ coi lệ phí xác lập quyền là khoản được trừ khi chia lợi ích, tức sau khi đã có doanh thu. Giữa hai kênh không có cơ chế chuyển tiếp.</w:t>
+        <w:t>Bảng 2.4 cho thấy nguồn lực không thiếu nhưng đặt chưa đúng chỗ. Quỹ Học bổng sau tiến sĩ Ngô Xuân Độ có ngân sách 5 tỷ đồng, có khoản chi phí khác đủ trang trải chi phí đăng ký và quy định rõ về đồng sở hữu văn bằng, nhưng chỉ dành cho nhà khoa học theo diện học bổng sau tiến sĩ. Đề tài cấp cơ sở, kênh duy nhất đến nay tạo ra sản phẩm đủ điều kiện xác lập quyền, chỉ được Nhà trường cấp 424,75 triệu đồng trong năm năm, bằng 8,5% ngân sách Quỹ, và không có dòng chi cho phí nộp đơn, phí duy trì hiệu lực. Điều 38 Quyết định 213 không có mục chi riêng cho lệ phí đăng ký; Điều 13 Quyết định 217 chỉ coi lệ phí xác lập quyền là khoản được trừ khi chia lợi ích, tức sau khi đã có doanh thu. Giữa hai kênh không có cơ chế chuyển tiếp.</w:t>
       </w:r>
     </w:p>
     <w:p>
@@ -5438,7 +4757,7 @@
         <w:rPr>
           <w:szCs w:val="26"/>
         </w:rPr>
-        <w:t>Hình 2.5 lượng hóa hệ quả: trong 16 tiêu chí đánh giá hiệu quả quản lý quyền sở hữu trí tuệ xây dựng tại Mục 1.4.2, chỉ 5 tiêu chí tính được đầy đủ, 4 tiêu chí tính được một phần và 7 tiêu chí chưa tính được; nhóm kết quả không có tiêu chí nào tính được đầy đủ. Nhà trường đo được đã xác lập bao nhiêu quyền nhưng chưa đo được quyền mang lại giá trị gì. Đây lại là nhóm thông tin phải công khai theo điểm đ khoản 3 Điều 28 Luật Giáo dục đại học số 125/2025/QH15 và phải nhất quán trên HEMIS theo tiêu chí 1.3 của Chuẩn cơ sở giáo dục đại học mới.</w:t>
+        <w:t>Hình 2.5 lượng hóa hệ quả: trong 16 tiêu chí đánh giá hiệu quả quản lý quyền sở hữu trí tuệ xây dựng tại Mục 1.4.2, chỉ 5 tiêu chí tính được đầy đủ, 4 tiêu chí tính được một phần và 7 tiêu chí chưa tính được; nhóm kết quả không có tiêu chí nào tính được đầy đủ. Nhà trường đo được đã xác lập bao nhiêu quyền nhưng chưa đo được quyền mang lại giá trị gì. Đây lại là nhóm thông tin phải công khai theo điểm đ khoản 3 Điều 28 Luật Giáo dục đại học số 125/2025/QH15.</w:t>
       </w:r>
     </w:p>
     <w:p>
@@ -5487,7 +4806,7 @@
         <w:rPr>
           <w:szCs w:val="26"/>
         </w:rPr>
-        <w:t>Bảng 2.6 đối sánh ba lớp: đối tượng quyền theo Luật Sở hữu trí tuệ, tài sản được liệt kê tại Điều 34 Quyết định 213 và Điều 3 Quyết định 217, và thực tế phát sinh giai đoạn 2021 - 2025.</w:t>
+        <w:t>Bảng 2.5 đối sánh ba lớp: đối tượng quyền theo Luật Sở hữu trí tuệ, tài sản được liệt kê tại Điều 34 Quyết định 213 và Điều 3 Quyết định 217, và thực tế phát sinh giai đoạn 2021 - 2025.</w:t>
       </w:r>
     </w:p>
     <w:p>
@@ -5505,7 +4824,7 @@
           <w:b/>
           <w:szCs w:val="26"/>
         </w:rPr>
-        <w:t>Bảng 2.6. Đối sánh đối tượng quyền theo Luật, theo quy chế nội bộ và theo thực tế phát sinh</w:t>
+        <w:t>Bảng 2.5. Đối sánh đối tượng quyền theo Luật, theo quy chế nội bộ và theo thực tế phát sinh</w:t>
       </w:r>
     </w:p>
     <w:tbl>
@@ -6660,7 +5979,7 @@
         <w:rPr>
           <w:szCs w:val="26"/>
         </w:rPr>
-        <w:t>Bảng 2.6 cho thấy Nhà trường phát sinh tài sản ở nhiều nhóm đối tượng nhưng mới xác lập quyền ở bốn nhóm, trong đó ba nhóm đã có văn bằng. Giải pháp hữu ích và sưu tập dữ liệu, hai nhóm mà sản phẩm đề tài cấp cơ sở rơi vào nhiều nhất, đều đã có trong quy chế nhưng chưa sản phẩm nào được xác lập quyền; giáo trình, nhóm có khả năng khai thác trong đào tạo, chưa được đăng ký quyền tác giả. Khoảng trống vì vậy nằm ở khâu nhận diện, không nằm ở phạm vi văn bản.</w:t>
+        <w:t>Bảng 2.5 cho thấy Nhà trường phát sinh tài sản ở nhiều nhóm đối tượng nhưng mới xác lập quyền ở bốn nhóm, trong đó ba nhóm đã có văn bằng. Giải pháp hữu ích và sưu tập dữ liệu, hai nhóm mà sản phẩm đề tài cấp cơ sở rơi vào nhiều nhất, đều đã có trong quy chế nhưng chưa sản phẩm nào được xác lập quyền; giáo trình, nhóm có khả năng khai thác trong đào tạo, chưa được đăng ký quyền tác giả. Khoảng trống vì vậy nằm ở khâu nhận diện, không nằm ở phạm vi văn bản.</w:t>
       </w:r>
     </w:p>
     <w:p>
@@ -6691,7 +6010,7 @@
         <w:rPr>
           <w:szCs w:val="26"/>
         </w:rPr>
-        <w:t>Đến thời điểm nghiên cứu, Nhà trường sở hữu 12 tài sản trí tuệ đã được xác lập quyền hoặc đang xử lý đơn, được liệt kê tại Bảng 2.7.</w:t>
+        <w:t>Đến thời điểm nghiên cứu, Nhà trường sở hữu 12 tài sản trí tuệ đã được xác lập quyền hoặc đang xử lý đơn, được liệt kê tại Bảng 2.6.</w:t>
       </w:r>
     </w:p>
     <w:p>
@@ -6709,7 +6028,7 @@
           <w:b/>
           <w:szCs w:val="26"/>
         </w:rPr>
-        <w:t>Bảng 2.7. Tài sản trí tuệ thuộc sở hữu của Trường Đại học Thành Đô</w:t>
+        <w:t>Bảng 2.6. Tài sản trí tuệ thuộc sở hữu của Trường Đại học Thành Đô</w:t>
       </w:r>
     </w:p>
     <w:tbl>
@@ -8614,7 +7933,7 @@
           <w:i/>
           <w:szCs w:val="26"/>
         </w:rPr>
-        <w:t>Nguồn: Nhóm nghiên cứu tổng hợp từ Bảng 2.7.</w:t>
+        <w:t>Nguồn: Nhóm nghiên cứu tổng hợp từ Bảng 2.6.</w:t>
       </w:r>
     </w:p>
     <w:p>
@@ -8627,7 +7946,7 @@
         <w:rPr>
           <w:szCs w:val="26"/>
         </w:rPr>
-        <w:t>Bảng 2.7 và Hình 2.6 cho thấy danh mục hình thành từ ba luồng với kết quả rất khác nhau. Luồng thương hiệu gồm 4 tài sản, đều do Nhà trường đơn sở hữu và đều đã có văn bằng. Luồng hợp tác doanh nghiệp gồm 5 kiểu dáng công nghiệp và 1 nhãn hiệu, đều đồng sở hữu với cùng một doanh nghiệp; riêng năm 2024 có 5 kiểu dáng được cấp, nâng số lũy kế từ 4 lên 9 tài sản. Luồng nghiên cứu chỉ có 2 đơn sáng chế nộp năm 2025 và 2026, chưa có văn bằng. Như vậy, khoảng 475 sản phẩm khoa học chỉ đóng góp 2 trên 12 tài sản; năng lực xác lập quyền sở hữu công nghiệp phụ thuộc đáng kể vào một đối tác; và kiểu dáng công nghiệp chỉ bảo hộ hình dáng bên ngoài, không bảo hộ công thức hay quy trình. Giải pháp hữu ích, loại hình phù hợp nhất với sản phẩm đề tài cấp cơ sở, vắng mặt hoàn toàn.</w:t>
+        <w:t>Bảng 2.6 và Hình 2.6 cho thấy danh mục hình thành từ ba luồng với kết quả rất khác nhau. Luồng thương hiệu gồm 4 tài sản, đều do Nhà trường đơn sở hữu và đều đã có văn bằng. Luồng hợp tác doanh nghiệp gồm 5 kiểu dáng công nghiệp và 1 nhãn hiệu, đều đồng sở hữu với cùng một doanh nghiệp; riêng năm 2024 có 5 kiểu dáng được cấp, nâng số lũy kế từ 4 lên 9 tài sản. Luồng nghiên cứu chỉ có 2 đơn sáng chế nộp năm 2025 và 2026, chưa có văn bằng. Như vậy, khoảng 475 sản phẩm khoa học chỉ đóng góp 2 trên 12 tài sản; năng lực xác lập quyền sở hữu công nghiệp phụ thuộc đáng kể vào một đối tác; và kiểu dáng công nghiệp chỉ bảo hộ hình dáng bên ngoài, không bảo hộ công thức hay quy trình. Giải pháp hữu ích, loại hình phù hợp nhất với sản phẩm đề tài cấp cơ sở, vắng mặt hoàn toàn.</w:t>
       </w:r>
     </w:p>
     <w:p>
@@ -8671,7 +7990,7 @@
         <w:rPr>
           <w:szCs w:val="26"/>
         </w:rPr>
-        <w:t>Rà soát cột sản phẩm nghiệm thu của 38 đề tài cấp cơ sở cho thấy 11 đề tài có sản phẩm cụ thể đủ điều kiện xác lập quyền ngoài báo cáo và bài báo, được liệt kê tại Bảng 2.8.</w:t>
+        <w:t>Rà soát cột sản phẩm nghiệm thu của 38 đề tài cấp cơ sở cho thấy 11 đề tài có sản phẩm cụ thể đủ điều kiện xác lập quyền ngoài báo cáo và bài báo, được liệt kê tại Bảng 2.7.</w:t>
       </w:r>
     </w:p>
     <w:p>
@@ -8689,7 +8008,7 @@
           <w:b/>
           <w:szCs w:val="26"/>
         </w:rPr>
-        <w:t>Bảng 2.8. Đề tài cấp cơ sở có sản phẩm đủ điều kiện xác lập quyền, giai đoạn 2021 - 2025</w:t>
+        <w:t>Bảng 2.7. Đề tài cấp cơ sở có sản phẩm đủ điều kiện xác lập quyền, giai đoạn 2021 - 2025</w:t>
       </w:r>
     </w:p>
     <w:tbl>
@@ -9994,7 +9313,7 @@
           <w:i/>
           <w:szCs w:val="26"/>
         </w:rPr>
-        <w:t>Nguồn: Nhóm nghiên cứu tổng hợp từ Bảng 2.8.</w:t>
+        <w:t>Nguồn: Nhóm nghiên cứu tổng hợp từ Bảng 2.7.</w:t>
       </w:r>
     </w:p>
     <w:p>
@@ -10007,7 +9326,7 @@
         <w:rPr>
           <w:szCs w:val="26"/>
         </w:rPr>
-        <w:t>Hình 2.7 cho thấy 9 trên 11 sản phẩm thuộc nhóm sở hữu công nghiệp và giải pháp hữu ích phù hợp với 8 sản phẩm. Loại hình này không đòi hỏi trình độ sáng tạo như sáng chế, phù hợp với quy mô đề tài cấp cơ sở và theo Chuẩn cơ sở giáo dục đại học mới được tính 3 sản phẩm quy đổi mỗi văn bằng, nhưng chưa sản phẩm nào được nộp đơn theo hình thức này. Mười trên 11 sản phẩm thuộc lĩnh vực dược, nên tiềm năng sở hữu công nghiệp của Nhà trường có thể được quản lý có trọng tâm.</w:t>
+        <w:t>Hình 2.7 cho thấy 9 trên 11 sản phẩm thuộc nhóm sở hữu công nghiệp và giải pháp hữu ích phù hợp với 8 sản phẩm. Loại hình này không đòi hỏi trình độ sáng tạo như sáng chế, có thời hạn bảo hộ ngắn hơn và phù hợp với quy mô đề tài cấp cơ sở, nhưng chưa sản phẩm nào được nộp đơn theo hình thức này. Mười trên 11 sản phẩm thuộc lĩnh vực dược, nên tiềm năng sở hữu công nghiệp của Nhà trường có thể được quản lý có trọng tâm.</w:t>
       </w:r>
     </w:p>
     <w:p>
@@ -10070,7 +9389,7 @@
           <w:i/>
           <w:szCs w:val="26"/>
         </w:rPr>
-        <w:t>Nguồn: Nhóm nghiên cứu tính toán từ danh mục đề tài cấp cơ sở và Bảng 2.8.</w:t>
+        <w:t>Nguồn: Nhóm nghiên cứu tính toán từ danh mục đề tài cấp cơ sở và Bảng 2.7.</w:t>
       </w:r>
     </w:p>
     <w:p>
@@ -10179,7 +9498,7 @@
         <w:rPr>
           <w:szCs w:val="26"/>
         </w:rPr>
-        <w:t>Như vậy, khai thác tài sản trí tuệ hiện chủ yếu ở dạng phi thương mại, phục vụ đào tạo của chính Nhà trường. Khai thác có thu phí mới có hai hợp đồng, do một đơn vị thực hiện và đối với sách chuyên khảo; chín văn bằng đã được cấp chưa phát sinh giao dịch chuyển giao quyền nào. Năng lực khai thác gắn với tư cách pháp lý và chức năng được giao của Viện Nghiên cứu giáo dục và Chuyển giao tri thức, không phân bố theo năng lực chuyên môn. Đây cũng là nội dung có dữ liệu mỏng nhất, vì hệ thống thống kê không theo dõi việc sử dụng và khai thác tài sản trí tuệ, trong khi Bảng 6B của Chuẩn cơ sở giáo dục đại học mới yêu cầu tách riêng khoản thu từ thương mại hóa kết quả nghiên cứu và sở hữu trí tuệ.</w:t>
+        <w:t>Như vậy, khai thác tài sản trí tuệ hiện chủ yếu ở dạng phi thương mại, phục vụ đào tạo của chính Nhà trường. Khai thác có thu phí mới có hai hợp đồng, do một đơn vị thực hiện và đối với sách chuyên khảo; chín văn bằng đã được cấp chưa phát sinh giao dịch chuyển giao quyền nào. Năng lực khai thác gắn với tư cách pháp lý và chức năng được giao của Viện Nghiên cứu giáo dục và Chuyển giao tri thức, không phân bố theo năng lực chuyên môn. Đây cũng là nội dung có dữ liệu mỏng nhất, vì hệ thống thống kê không theo dõi việc sử dụng và khai thác tài sản trí tuệ; bản thân việc thiếu dữ liệu này là một phát hiện về thực trạng quản lý.</w:t>
       </w:r>
     </w:p>
     <w:p>
@@ -10210,7 +9529,7 @@
         <w:rPr>
           <w:szCs w:val="26"/>
         </w:rPr>
-        <w:t>Kết quả hai năm 2024 - 2025 được đối chiếu trước hết với Kế hoạch hoạt động khoa học công nghệ giai đoạn 2024 - 2028 ban hành kèm Kế hoạch số 07/KH-ĐHTĐ ngày 01 tháng 7 năm 2024. Đây là thước đo do chính Nhà trường đặt ra và là loại chỉ số hoạt động chính mà tiêu chí 1.2 của Chuẩn cơ sở giáo dục đại học mới yêu cầu đạt tối thiểu 50%.</w:t>
+        <w:t>Kết quả hai năm 2024 - 2025 được đối chiếu trước hết với Kế hoạch hoạt động khoa học công nghệ giai đoạn 2024 - 2028 ban hành kèm Kế hoạch số 07/KH-ĐHTĐ ngày 01 tháng 7 năm 2024. Đây là thước đo khách quan vì do chính Nhà trường đặt ra, và 2024 - 2025 là hai năm đầu của kế hoạch.</w:t>
       </w:r>
     </w:p>
     <w:p>
@@ -10330,7 +9649,7 @@
         <w:rPr>
           <w:szCs w:val="26"/>
         </w:rPr>
-        <w:t>Thứ nhất, Nhà trường có hệ thống quy định về sở hữu trí tuệ từ sớm. Quyết định 213 năm 2021 đã có một chương riêng với phạm vi tài sản khá đầy đủ và quy trình đăng ký một cửa; Quyết định 217 năm 2024 mở rộng phạm vi tài sản, bổ sung nguyên tắc công bố và bảo mật, phân công đầu mối. Đây là nền để đáp ứng nội dung quản trị bắt buộc về sở hữu trí tuệ của Chuẩn cơ sở giáo dục đại học mới.</w:t>
+        <w:t>Thứ nhất, Nhà trường có hệ thống quy định về sở hữu trí tuệ từ sớm. Quyết định 213 năm 2021 đã có một chương riêng với phạm vi tài sản khá đầy đủ và quy trình đăng ký một cửa; Quyết định 217 năm 2024 mở rộng phạm vi tài sản, bổ sung nguyên tắc công bố và bảo mật, phân công đầu mối.</w:t>
       </w:r>
     </w:p>
     <w:p>
@@ -10426,7 +9745,7 @@
         <w:rPr>
           <w:szCs w:val="26"/>
         </w:rPr>
-        <w:t>Thứ hai, hệ thống quy định chồng lấn và chưa theo kịp pháp luật: bốn văn bản chứa năm quy định chia lợi ích, mức trần 100 triệu đồng không còn tương thích với Điều 135 Luật Sở hữu trí tuệ hiện hành, và chưa có quy định về liêm chính khoa học, liêm chính học thuật đi kèm như nội dung bắt buộc của Chuẩn cơ sở giáo dục đại học mới.</w:t>
+        <w:t>Thứ hai, hệ thống quy định chồng lấn và chưa theo kịp pháp luật: bốn văn bản chứa năm quy định chia lợi ích, và mức trần 100 triệu đồng không còn tương thích với Điều 135 Luật Sở hữu trí tuệ hiện hành.</w:t>
       </w:r>
     </w:p>
     <w:p>
@@ -10465,7 +9784,7 @@
         <w:rPr>
           <w:szCs w:val="26"/>
         </w:rPr>
-        <w:t>Thứ năm, hệ thống dữ liệu chưa đáp ứng yêu cầu quản lý và yêu cầu dữ liệu trên HEMIS: không có danh mục tài sản trí tuệ trong hệ thống thống kê, độ phủ khai báo khoảng 29,9%, 7 trên 16 tiêu chí đánh giá chưa tính được.</w:t>
+        <w:t>Thứ năm, hệ thống dữ liệu chưa đáp ứng yêu cầu quản lý và nghĩa vụ công khai: không có danh mục tài sản trí tuệ trong hệ thống thống kê, độ phủ khai báo khoảng 29,9%, 7 trên 16 tiêu chí đánh giá chưa tính được.</w:t>
       </w:r>
     </w:p>
     <w:p>
@@ -10539,7 +9858,7 @@
         <w:rPr>
           <w:szCs w:val="26"/>
         </w:rPr>
-        <w:t>Thứ nhất, khung pháp luật thay đổi dồn dập trong giai đoạn 2025 - 2026, gồm Luật Khoa học, công nghệ và đổi mới sáng tạo số 93/2025/QH15 có hiệu lực từ ngày 01 tháng 10 năm 2025, Luật Giáo dục đại học số 125/2025/QH15, Luật số 131/2025/QH15 sửa đổi Luật Sở hữu trí tuệ có hiệu lực từ ngày 01 tháng 4 năm 2026, Kết luận số 51-KL/TW ngày 17 tháng 6 năm 2026, Quyết định số 1624/QĐ-TTg ngày 21 tháng 8 năm 2026 và Thông tư số 83/2026/TT-BGDĐT ngày 30 tháng 9 năm 2026. Quy chế ban hành năm 2021 được xây dựng trên khung cũ nên một số quy định như mức trần thù lao không còn tương thích.</w:t>
+        <w:t>Thứ nhất, khung pháp luật thay đổi dồn dập trong giai đoạn 2025 - 2026, gồm Luật Khoa học, công nghệ và đổi mới sáng tạo số 93/2025/QH15 có hiệu lực từ ngày 01 tháng 10 năm 2025, Luật Giáo dục đại học số 125/2025/QH15, Luật số 131/2025/QH15 sửa đổi Luật Sở hữu trí tuệ có hiệu lực từ ngày 01 tháng 4 năm 2026, Kết luận số 51-KL/TW ngày 17 tháng 6 năm 2026 và Quyết định số 1624/QĐ-TTg ngày 21 tháng 8 năm 2026. Quy chế ban hành năm 2021 được xây dựng trên khung cũ nên một số quy định như mức trần thù lao không còn tương thích.</w:t>
       </w:r>
     </w:p>
     <w:p>
@@ -10566,19 +9885,6 @@
           <w:szCs w:val="26"/>
         </w:rPr>
         <w:t>Thứ ba, cơ cấu ngành chủ yếu thuộc kinh tế, quản lý, ngôn ngữ, giáo dục và pháp luật, vốn chủ yếu tạo ra tác phẩm thuộc quyền tác giả; tiềm năng sở hữu công nghiệp tập trung ở lĩnh vực dược.</w:t>
-      </w:r>
-    </w:p>
-    <w:p>
-      <w:pPr>
-        <w:rPr>
-          <w:szCs w:val="26"/>
-        </w:rPr>
-      </w:pPr>
-      <w:r>
-        <w:rPr>
-          <w:szCs w:val="26"/>
-        </w:rPr>
-        <w:t>Thứ tư, các thước đo đánh giá bên ngoài vẫn đặt trọng số lớn vào công bố quốc tế. Theo Chuẩn cơ sở giáo dục đại học mới, Nhà trường vượt ngưỡng kết quả khoa học công nghệ mà không cần văn bằng, còn ngưỡng công bố WoS, Scopus là ràng buộc thực sự và không tính văn bằng; sức ép từ bên ngoài vì vậy tiếp tục hướng về công bố.</w:t>
       </w:r>
     </w:p>
     <w:p>

</xml_diff>